<commit_message>
Corrections du chapitre après vérification en contexte neuf
7 écarts chiffrés corrigés : chronos Spark alignés sur la version
commitée du notebook 01 (x58, 23,9 s), « la moitié » -> 36,6 % (erreur
présente jusque dans le markdown du notebook 03, reconstruit), pic de
taux 3,6 % et non 4 % (chapitre, cadrage, journal), R² 0,08 attribué à
l'OLS, chiffres du stock cités depuis le notebook 05 (103/8/16) avec
mention de l'écart plateforme. Docx régénéré (16 images). Journal_memoire
complété.

Co-Authored-By: Claude Fable 5 <noreply@anthropic.com>
Claude-Session: https://claude.ai/code/session_01D4Q7SubNSFt4x4hRgGff8F
</commit_message>
<xml_diff>
--- a/memoire/chapitre_copilote_financier.docx
+++ b/memoire/chapitre_copilote_financier.docx
@@ -465,7 +465,13 @@
         <w:t xml:space="preserve"> </w:t>
       </w:r>
       <w:r>
-        <w:t xml:space="preserve">moyen des crédits habitat est passé d’environ 1,1 % à 4 % avant de refluer</w:t>
+        <w:t xml:space="preserve">moyen des crédits habitat est passé d’environ 1,1 % à un pic de 3,6 % fin</w:t>
+      </w:r>
+      <w:r>
+        <w:t xml:space="preserve"> </w:t>
+      </w:r>
+      <w:r>
+        <w:t xml:space="preserve">2023, avant de refluer</w:t>
       </w:r>
       <w:r>
         <w:t xml:space="preserve"> </w:t>
@@ -2440,7 +2446,7 @@
         <w:t xml:space="preserve"> </w:t>
       </w:r>
       <w:r>
-        <w:t xml:space="preserve">environ 25 Mo), Spark est environ vingt-huit fois</w:t>
+        <w:t xml:space="preserve">soit 9 Mo une fois chargées en mémoire), Spark est cinquante-huit fois</w:t>
       </w:r>
       <w:r>
         <w:t xml:space="preserve"> </w:t>
@@ -2456,13 +2462,19 @@
         <w:t xml:space="preserve"> </w:t>
       </w:r>
       <w:r>
-        <w:t xml:space="preserve">que</w:t>
-      </w:r>
-      <w:r>
-        <w:t xml:space="preserve"> </w:t>
-      </w:r>
-      <w:r>
-        <w:t xml:space="preserve">pandas, après 27 secondes de démarrage de session. Le passage à l’échelle</w:t>
+        <w:t xml:space="preserve">que pandas sur l’agrégation chronométrée, après 23,9</w:t>
+      </w:r>
+      <w:r>
+        <w:t xml:space="preserve"> </w:t>
+      </w:r>
+      <w:r>
+        <w:t xml:space="preserve">secondes de démarrage de session — les chronos varient d’une machine à</w:t>
+      </w:r>
+      <w:r>
+        <w:t xml:space="preserve"> </w:t>
+      </w:r>
+      <w:r>
+        <w:t xml:space="preserve">l’autre, l’ordre de grandeur et la conclusion non. Le passage à l’échelle</w:t>
       </w:r>
       <w:r>
         <w:t xml:space="preserve"> </w:t>
@@ -2474,7 +2486,7 @@
         <w:t xml:space="preserve"> </w:t>
       </w:r>
       <w:r>
-        <w:t xml:space="preserve">présenter Spark comme un gain sur 25 Mo serait une erreur de diagnostic.</w:t>
+        <w:t xml:space="preserve">présenter Spark comme un gain sur moins de 10 Mo serait une erreur de diagnostic.</w:t>
       </w:r>
     </w:p>
     <w:bookmarkEnd w:id="41"/>
@@ -2559,25 +2571,31 @@
         <w:t xml:space="preserve"> </w:t>
       </w:r>
       <w:r>
-        <w:t xml:space="preserve">positives). Sur ce périmètre, la moitié des opérations n’a aucun</w:t>
-      </w:r>
-      <w:r>
-        <w:t xml:space="preserve"> </w:t>
-      </w:r>
-      <w:r>
-        <w:t xml:space="preserve">dépassement engagé, mais 28 % franchissent le seuil de dérive matérielle</w:t>
-      </w:r>
-      <w:r>
-        <w:t xml:space="preserve"> </w:t>
-      </w:r>
-      <w:r>
-        <w:t xml:space="preserve">fixé à 2 % de la marge, avec quelques cas extrêmes au-delà de la moitié de</w:t>
-      </w:r>
-      <w:r>
-        <w:t xml:space="preserve"> </w:t>
-      </w:r>
-      <w:r>
-        <w:t xml:space="preserve">la marge budgétée (Figure 5).</w:t>
+        <w:t xml:space="preserve">positives). Sur ce périmètre, plus d’un tiers des opérations (36,6 %) n’a</w:t>
+      </w:r>
+      <w:r>
+        <w:t xml:space="preserve"> </w:t>
+      </w:r>
+      <w:r>
+        <w:t xml:space="preserve">aucun dépassement engagé et la médiane de variation est quasi nulle, mais</w:t>
+      </w:r>
+      <w:r>
+        <w:t xml:space="preserve"> </w:t>
+      </w:r>
+      <w:r>
+        <w:t xml:space="preserve">28 % franchissent le seuil de dérive matérielle fixé à 2 % de la marge,</w:t>
+      </w:r>
+      <w:r>
+        <w:t xml:space="preserve"> </w:t>
+      </w:r>
+      <w:r>
+        <w:t xml:space="preserve">avec deux cas extrêmes au-delà de la moitié de la marge budgétée</w:t>
+      </w:r>
+      <w:r>
+        <w:t xml:space="preserve"> </w:t>
+      </w:r>
+      <w:r>
+        <w:t xml:space="preserve">(Figure 5).</w:t>
       </w:r>
     </w:p>
     <w:p>
@@ -2742,19 +2760,25 @@
         <w:t xml:space="preserve"> </w:t>
       </w:r>
       <w:r>
-        <w:t xml:space="preserve">le paramètre choisi par validation croisée) stabilise les coefficients</w:t>
-      </w:r>
-      <w:r>
-        <w:t xml:space="preserve"> </w:t>
-      </w:r>
-      <w:r>
-        <w:t xml:space="preserve">(Figure 6), mais le pouvoir explicatif reste modeste — un R² de 0,08 sur</w:t>
-      </w:r>
-      <w:r>
-        <w:t xml:space="preserve"> </w:t>
-      </w:r>
-      <w:r>
-        <w:t xml:space="preserve">l’échantillon test — et je l’assume comme un résultat honnête : la</w:t>
+        <w:t xml:space="preserve">le paramètre choisi par validation croisée) stabilise les coefficients et</w:t>
+      </w:r>
+      <w:r>
+        <w:t xml:space="preserve"> </w:t>
+      </w:r>
+      <w:r>
+        <w:t xml:space="preserve">en permet une lecture comparée (Figure 6), mais le pouvoir explicatif</w:t>
+      </w:r>
+      <w:r>
+        <w:t xml:space="preserve"> </w:t>
+      </w:r>
+      <w:r>
+        <w:t xml:space="preserve">reste modeste — un R² de 0,08 sur l’échantillon test pour les moindres</w:t>
+      </w:r>
+      <w:r>
+        <w:t xml:space="preserve"> </w:t>
+      </w:r>
+      <w:r>
+        <w:t xml:space="preserve">carrés ordinaires, que la régularisation n’améliore pas — et je l’assume comme un résultat honnête : la</w:t>
       </w:r>
       <w:r>
         <w:t xml:space="preserve"> </w:t>
@@ -3586,13 +3610,25 @@
         <w:t xml:space="preserve"> </w:t>
       </w:r>
       <w:r>
-        <w:t xml:space="preserve">erreur type sont signalés (Figure 10) — 111 sont dans le marché, 4</w:t>
-      </w:r>
-      <w:r>
-        <w:t xml:space="preserve"> </w:t>
-      </w:r>
-      <w:r>
-        <w:t xml:space="preserve">au-dessus, 12 en dessous à la date de l’export.</w:t>
+        <w:t xml:space="preserve">erreur type sont signalés (Figure 10) — 103 sont dans le marché, 8</w:t>
+      </w:r>
+      <w:r>
+        <w:t xml:space="preserve"> </w:t>
+      </w:r>
+      <w:r>
+        <w:t xml:space="preserve">au-dessus, 16 en dessous à la date de l’export. (La plateforme, qui</w:t>
+      </w:r>
+      <w:r>
+        <w:t xml:space="preserve"> </w:t>
+      </w:r>
+      <w:r>
+        <w:t xml:space="preserve">ré-estime le modèle sur l’ensemble des transactions, aboutit à un</w:t>
+      </w:r>
+      <w:r>
+        <w:t xml:space="preserve"> </w:t>
+      </w:r>
+      <w:r>
+        <w:t xml:space="preserve">classement légèrement plus clément : 111/4/12.)</w:t>
       </w:r>
     </w:p>
     <w:p>

</xml_diff>

<commit_message>
Chapitre recadré : mémoire académique proportionné à la problématique
Le texte présente chaque méthode comme un choix motivé par le problème,
sans signaler d'excédent de travail au jury (qui n'a accès ni aux
notebooks ni aux données) : cadrage introductif réécrit, comparaison de
classifieurs ramenée à une phrase sobre, renvois aux notebooks retirés
des légendes, argument de reproductibilité conservé. Aucun chiffre
modifié (tous déjà vérifiés). PDF (12 pages) et DOCX (9 images)
régénérés.

Co-Authored-By: Claude Fable 5 <noreply@anthropic.com>
Claude-Session: https://claude.ai/code/session_01D4Q7SubNSFt4x4hRgGff8F
</commit_message>
<xml_diff>
--- a/memoire/chapitre_copilote_financier.docx
+++ b/memoire/chapitre_copilote_financier.docx
@@ -215,13 +215,13 @@
         <w:t xml:space="preserve"> </w:t>
       </w:r>
       <w:r>
-        <w:t xml:space="preserve">intégration au mémoire. Tous les chiffres proviennent des notebooks</w:t>
-      </w:r>
-      <w:r>
-        <w:t xml:space="preserve"> </w:t>
-      </w:r>
-      <w:r>
-        <w:t xml:space="preserve">exécutés du dépôt</w:t>
+        <w:t xml:space="preserve">intégration au mémoire. Tous les chiffres proviennent des analyses</w:t>
+      </w:r>
+      <w:r>
+        <w:t xml:space="preserve"> </w:t>
+      </w:r>
+      <w:r>
+        <w:t xml:space="preserve">exécutées du projet (dépôt</w:t>
       </w:r>
       <w:r>
         <w:t xml:space="preserve"> </w:t>
@@ -233,10 +233,13 @@
         <w:t xml:space="preserve">MemoireM2S2</w:t>
       </w:r>
       <w:r>
-        <w:t xml:space="preserve"> </w:t>
-      </w:r>
-      <w:r>
-        <w:t xml:space="preserve">(branche principale).</w:t>
+        <w:t xml:space="preserve">) — cet encadré est à retirer</w:t>
+      </w:r>
+      <w:r>
+        <w:t xml:space="preserve"> </w:t>
+      </w:r>
+      <w:r>
+        <w:t xml:space="preserve">lors de l’intégration.</w:t>
       </w:r>
     </w:p>
     <w:p>
@@ -256,61 +259,49 @@
         <w:t xml:space="preserve"> </w:t>
       </w:r>
       <w:r>
-        <w:t xml:space="preserve">construit sur les données de gestion du groupe Angelotti. Le dépôt du</w:t>
-      </w:r>
-      <w:r>
-        <w:t xml:space="preserve"> </w:t>
-      </w:r>
-      <w:r>
-        <w:t xml:space="preserve">projet contient davantage que ce qui est raconté ici : sept notebooks y</w:t>
-      </w:r>
-      <w:r>
-        <w:t xml:space="preserve"> </w:t>
-      </w:r>
-      <w:r>
-        <w:t xml:space="preserve">déroulent, pour les besoins de la validation académique, l’ensemble des</w:t>
-      </w:r>
-      <w:r>
-        <w:t xml:space="preserve"> </w:t>
-      </w:r>
-      <w:r>
-        <w:t xml:space="preserve">méthodes du Master, y compris des vérifications d’implémentation et des</w:t>
-      </w:r>
-      <w:r>
-        <w:t xml:space="preserve"> </w:t>
-      </w:r>
-      <w:r>
-        <w:t xml:space="preserve">comparaisons de modèles sans enjeu décisionnel. Ce chapitre fait un choix</w:t>
-      </w:r>
-      <w:r>
-        <w:t xml:space="preserve"> </w:t>
-      </w:r>
-      <w:r>
-        <w:t xml:space="preserve">assumé : raconter le travail qui sert la décision de l’entreprise, et</w:t>
-      </w:r>
-      <w:r>
-        <w:t xml:space="preserve"> </w:t>
-      </w:r>
-      <w:r>
-        <w:t xml:space="preserve">réduire le reste à ce qu’il est — des garde-fous. Le fil conducteur du</w:t>
-      </w:r>
-      <w:r>
-        <w:t xml:space="preserve"> </w:t>
-      </w:r>
-      <w:r>
-        <w:t xml:space="preserve">projet tient en une phrase : sur un jeu de données de cette taille, un</w:t>
-      </w:r>
-      <w:r>
-        <w:t xml:space="preserve"> </w:t>
-      </w:r>
-      <w:r>
-        <w:t xml:space="preserve">petit nombre de modèles simples et bien compris vaut mieux qu’un grand</w:t>
-      </w:r>
-      <w:r>
-        <w:t xml:space="preserve"> </w:t>
-      </w:r>
-      <w:r>
-        <w:t xml:space="preserve">appareillage, et le projet en apporte plusieurs preuves chiffrées.</w:t>
+        <w:t xml:space="preserve">construit sur les données de gestion du groupe Angelotti pour sa direction</w:t>
+      </w:r>
+      <w:r>
+        <w:t xml:space="preserve"> </w:t>
+      </w:r>
+      <w:r>
+        <w:t xml:space="preserve">financière. La démarche suit un principe directeur que la taille des</w:t>
+      </w:r>
+      <w:r>
+        <w:t xml:space="preserve"> </w:t>
+      </w:r>
+      <w:r>
+        <w:t xml:space="preserve">données impose : 267 opérations et 32 Mo d’exports appellent un petit</w:t>
+      </w:r>
+      <w:r>
+        <w:t xml:space="preserve"> </w:t>
+      </w:r>
+      <w:r>
+        <w:t xml:space="preserve">nombre de méthodes simples, choisies chacune pour une question précise et</w:t>
+      </w:r>
+      <w:r>
+        <w:t xml:space="preserve"> </w:t>
+      </w:r>
+      <w:r>
+        <w:t xml:space="preserve">validées rigoureusement — pas un empilement de modèles. Le chapitre</w:t>
+      </w:r>
+      <w:r>
+        <w:t xml:space="preserve"> </w:t>
+      </w:r>
+      <w:r>
+        <w:t xml:space="preserve">déroule cette démarche : cadrage du besoin, constitution d’une base de</w:t>
+      </w:r>
+      <w:r>
+        <w:t xml:space="preserve"> </w:t>
+      </w:r>
+      <w:r>
+        <w:t xml:space="preserve">données fiable, puis trois axes de modélisation et leur restitution dans</w:t>
+      </w:r>
+      <w:r>
+        <w:t xml:space="preserve"> </w:t>
+      </w:r>
+      <w:r>
+        <w:t xml:space="preserve">une application destinée aux contrôleurs de gestion.</w:t>
       </w:r>
     </w:p>
     <w:bookmarkStart w:id="23" w:name="contexte"/>
@@ -1234,40 +1225,25 @@
         <w:t xml:space="preserve"> </w:t>
       </w:r>
       <w:r>
-        <w:t xml:space="preserve">La commande</w:t>
-      </w:r>
-      <w:r>
-        <w:t xml:space="preserve"> </w:t>
-      </w:r>
-      <w:r>
-        <w:rPr>
-          <w:rStyle w:val="VerbatimChar"/>
-        </w:rPr>
-        <w:t xml:space="preserve">python src/base_sql.py</w:t>
-      </w:r>
-      <w:r>
-        <w:t xml:space="preserve"> </w:t>
-      </w:r>
-      <w:r>
-        <w:t xml:space="preserve">reconstruit l’ensemble en quelques</w:t>
-      </w:r>
-      <w:r>
-        <w:t xml:space="preserve"> </w:t>
-      </w:r>
-      <w:r>
-        <w:t xml:space="preserve">secondes ; les notebooks sont générés et ré-exécutés de bout en bout par</w:t>
-      </w:r>
-      <w:r>
-        <w:t xml:space="preserve"> </w:t>
-      </w:r>
-      <w:r>
-        <w:t xml:space="preserve">des scripts versionnés, de sorte que chaque chiffre de ce chapitre</w:t>
-      </w:r>
-      <w:r>
-        <w:t xml:space="preserve"> </w:t>
-      </w:r>
-      <w:r>
-        <w:t xml:space="preserve">correspond à une cellule réellement exécutée.</w:t>
+        <w:t xml:space="preserve">Une seule commande reconstruit l’ensemble depuis les exports bruts en</w:t>
+      </w:r>
+      <w:r>
+        <w:t xml:space="preserve"> </w:t>
+      </w:r>
+      <w:r>
+        <w:t xml:space="preserve">quelques secondes, et l’analyse complète est versionnée et ré-exécutable</w:t>
+      </w:r>
+      <w:r>
+        <w:t xml:space="preserve"> </w:t>
+      </w:r>
+      <w:r>
+        <w:t xml:space="preserve">de bout en bout : tous les résultats présentés dans ce chapitre sont</w:t>
+      </w:r>
+      <w:r>
+        <w:t xml:space="preserve"> </w:t>
+      </w:r>
+      <w:r>
+        <w:t xml:space="preserve">reproductibles.</w:t>
       </w:r>
     </w:p>
     <w:bookmarkEnd w:id="27"/>
@@ -1344,7 +1320,7 @@
           <wp:inline>
             <wp:extent cx="5334000" cy="3374934"/>
             <wp:effectExtent b="0" l="0" r="0" t="0"/>
-            <wp:docPr descr="Figure 1 — Prix au m² des appartements : distribution brute et après transformation logarithmique (notebook 00)." title="" id="29" name="Picture"/>
+            <wp:docPr descr="Figure 1 — Prix au m² des appartements : distribution brute et après transformation logarithmique." title="" id="29" name="Picture"/>
             <a:graphic>
               <a:graphicData uri="http://schemas.openxmlformats.org/drawingml/2006/picture">
                 <pic:pic>
@@ -1387,7 +1363,7 @@
         <w:pStyle w:val="ImageCaption"/>
       </w:pPr>
       <w:r>
-        <w:t xml:space="preserve">Figure 1 — Prix au m² des appartements : distribution brute et après transformation logarithmique (notebook 00).</w:t>
+        <w:t xml:space="preserve">Figure 1 — Prix au m² des appartements : distribution brute et après transformation logarithmique.</w:t>
       </w:r>
     </w:p>
     <w:p>
@@ -1461,7 +1437,7 @@
           <wp:inline>
             <wp:extent cx="5334000" cy="1616228"/>
             <wp:effectExtent b="0" l="0" r="0" t="0"/>
-            <wp:docPr descr="Figure 2 — Intensité de vente (réservations par opération active) : l’effet de la remontée des taux apparaît une fois l’effet portefeuille neutralisé (notebook 00)." title="" id="32" name="Picture"/>
+            <wp:docPr descr="Figure 2 — Intensité de vente (réservations par opération active) : l’effet de la remontée des taux apparaît une fois l’effet portefeuille neutralisé." title="" id="32" name="Picture"/>
             <a:graphic>
               <a:graphicData uri="http://schemas.openxmlformats.org/drawingml/2006/picture">
                 <pic:pic>
@@ -1504,7 +1480,7 @@
         <w:pStyle w:val="ImageCaption"/>
       </w:pPr>
       <w:r>
-        <w:t xml:space="preserve">Figure 2 — Intensité de vente (réservations par opération active) : l’effet de la remontée des taux apparaît une fois l’effet portefeuille neutralisé (notebook 00).</w:t>
+        <w:t xml:space="preserve">Figure 2 — Intensité de vente (réservations par opération active) : l’effet de la remontée des taux apparaît une fois l’effet portefeuille neutralisé.</w:t>
       </w:r>
     </w:p>
     <w:bookmarkEnd w:id="34"/>
@@ -1548,55 +1524,61 @@
         <w:pStyle w:val="BodyText"/>
       </w:pPr>
       <w:r>
-        <w:t xml:space="preserve">Spark a été évalué comme piste de montée en charge, avec une conclusion</w:t>
-      </w:r>
-      <w:r>
-        <w:t xml:space="preserve"> </w:t>
-      </w:r>
-      <w:r>
-        <w:t xml:space="preserve">négative assumée : sur notre volumétrie (64 788 lignes, 9 Mo en mémoire),</w:t>
-      </w:r>
-      <w:r>
-        <w:t xml:space="preserve"> </w:t>
-      </w:r>
-      <w:r>
-        <w:t xml:space="preserve">l’agrégation chronométrée est environ cinquante fois plus lente qu’avec</w:t>
-      </w:r>
-      <w:r>
-        <w:t xml:space="preserve"> </w:t>
-      </w:r>
-      <w:r>
-        <w:t xml:space="preserve">pandas (rapport mesuré de 58, après 24 secondes de démarrage de la machine</w:t>
-      </w:r>
-      <w:r>
-        <w:t xml:space="preserve"> </w:t>
-      </w:r>
-      <w:r>
-        <w:t xml:space="preserve">virtuelle Java ; une exécution antérieure donnait 28 — le chiffre varie</w:t>
-      </w:r>
-      <w:r>
-        <w:t xml:space="preserve"> </w:t>
-      </w:r>
-      <w:r>
-        <w:t xml:space="preserve">avec la machine, la conclusion non). SQLite et pandas sont la bonne</w:t>
-      </w:r>
-      <w:r>
-        <w:t xml:space="preserve"> </w:t>
-      </w:r>
-      <w:r>
-        <w:t xml:space="preserve">architecture à cette échelle ; le chemin de montée en charge existe si le</w:t>
-      </w:r>
-      <w:r>
-        <w:t xml:space="preserve"> </w:t>
-      </w:r>
-      <w:r>
-        <w:t xml:space="preserve">périmètre s’étendait un jour au groupe Nexity entier, et c’est tout ce</w:t>
-      </w:r>
-      <w:r>
-        <w:t xml:space="preserve"> </w:t>
-      </w:r>
-      <w:r>
-        <w:t xml:space="preserve">qu’il fallait établir.</w:t>
+        <w:t xml:space="preserve">Spark a été évalué comme piste de montée en charge, l’entreprise</w:t>
+      </w:r>
+      <w:r>
+        <w:t xml:space="preserve"> </w:t>
+      </w:r>
+      <w:r>
+        <w:t xml:space="preserve">appartenant à un groupe dont le périmètre de données dépasse largement le</w:t>
+      </w:r>
+      <w:r>
+        <w:t xml:space="preserve"> </w:t>
+      </w:r>
+      <w:r>
+        <w:t xml:space="preserve">sien. Le test est concluant par la négative : sur notre volumétrie</w:t>
+      </w:r>
+      <w:r>
+        <w:t xml:space="preserve"> </w:t>
+      </w:r>
+      <w:r>
+        <w:t xml:space="preserve">(64 788 lignes, 9 Mo en mémoire), l’agrégation chronométrée est environ</w:t>
+      </w:r>
+      <w:r>
+        <w:t xml:space="preserve"> </w:t>
+      </w:r>
+      <w:r>
+        <w:t xml:space="preserve">cinquante fois plus lente qu’avec pandas (rapport mesuré de 58, après 24</w:t>
+      </w:r>
+      <w:r>
+        <w:t xml:space="preserve"> </w:t>
+      </w:r>
+      <w:r>
+        <w:t xml:space="preserve">secondes de démarrage de la machine virtuelle Java ; une exécution</w:t>
+      </w:r>
+      <w:r>
+        <w:t xml:space="preserve"> </w:t>
+      </w:r>
+      <w:r>
+        <w:t xml:space="preserve">antérieure donnait 28 — le chiffre varie avec la machine, la conclusion</w:t>
+      </w:r>
+      <w:r>
+        <w:t xml:space="preserve"> </w:t>
+      </w:r>
+      <w:r>
+        <w:t xml:space="preserve">non). SQLite et pandas constituent donc la bonne architecture à cette</w:t>
+      </w:r>
+      <w:r>
+        <w:t xml:space="preserve"> </w:t>
+      </w:r>
+      <w:r>
+        <w:t xml:space="preserve">échelle, et le chemin de montée en charge est identifié si le périmètre</w:t>
+      </w:r>
+      <w:r>
+        <w:t xml:space="preserve"> </w:t>
+      </w:r>
+      <w:r>
+        <w:t xml:space="preserve">s’étendait un jour au groupe Nexity.</w:t>
       </w:r>
     </w:p>
     <w:bookmarkEnd w:id="35"/>
@@ -1733,7 +1715,7 @@
           <wp:inline>
             <wp:extent cx="5334000" cy="1714181"/>
             <wp:effectExtent b="0" l="0" r="0" t="0"/>
-            <wp:docPr descr="Figure 3 — Distribution de la variation de marge « committée » sur les 123 opérations du périmètre, et seuil de dérive matérielle à -2 % (notebook 03)." title="" id="37" name="Picture"/>
+            <wp:docPr descr="Figure 3 — Distribution de la variation de marge « committée » sur les 123 opérations du périmètre, et seuil de dérive matérielle à -2 %." title="" id="37" name="Picture"/>
             <a:graphic>
               <a:graphicData uri="http://schemas.openxmlformats.org/drawingml/2006/picture">
                 <pic:pic>
@@ -1776,7 +1758,7 @@
         <w:pStyle w:val="ImageCaption"/>
       </w:pPr>
       <w:r>
-        <w:t xml:space="preserve">Figure 3 — Distribution de la variation de marge « committée » sur les 123 opérations du périmètre, et seuil de dérive matérielle à -2 % (notebook 03).</w:t>
+        <w:t xml:space="preserve">Figure 3 — Distribution de la variation de marge « committée » sur les 123 opérations du périmètre, et seuil de dérive matérielle à -2 %.</w:t>
       </w:r>
     </w:p>
     <w:p>
@@ -1865,61 +1847,43 @@
         <w:t xml:space="preserve"> </w:t>
       </w:r>
       <w:r>
-        <w:t xml:space="preserve">croisée selon le modèle (régression logistique 0,28, SVM 0,30, arbre</w:t>
-      </w:r>
-      <w:r>
-        <w:t xml:space="preserve"> </w:t>
-      </w:r>
-      <w:r>
-        <w:t xml:space="preserve">0,34, forêt aléatoire 0,31), contre 0 pour la base de référence qui ne</w:t>
-      </w:r>
-      <w:r>
-        <w:t xml:space="preserve"> </w:t>
-      </w:r>
-      <w:r>
-        <w:t xml:space="preserve">détecte rien. À 123 observations, ces écarts entre modèles sont dans le</w:t>
-      </w:r>
-      <w:r>
-        <w:t xml:space="preserve"> </w:t>
-      </w:r>
-      <w:r>
-        <w:t xml:space="preserve">bruit de la validation croisée : j’ai retenu un modèle interprétable (la</w:t>
-      </w:r>
-      <w:r>
-        <w:t xml:space="preserve"> </w:t>
-      </w:r>
-      <w:r>
-        <w:t xml:space="preserve">forêt, dont les probabilités alimentent les niveaux d’alerte), sans</w:t>
-      </w:r>
-      <w:r>
-        <w:t xml:space="preserve"> </w:t>
-      </w:r>
-      <w:r>
-        <w:t xml:space="preserve">prétendre que le tournoi de modèles départageait quoi que ce soit — un</w:t>
-      </w:r>
-      <w:r>
-        <w:t xml:space="preserve"> </w:t>
-      </w:r>
-      <w:r>
-        <w:t xml:space="preserve">perceptron multicouche testé en contrôle confirme d’ailleurs le</w:t>
-      </w:r>
-      <w:r>
-        <w:t xml:space="preserve"> </w:t>
-      </w:r>
-      <w:r>
-        <w:t xml:space="preserve">sur-ajustement attendu à cette taille (F1 de 0,91 en apprentissage contre</w:t>
-      </w:r>
-      <w:r>
-        <w:t xml:space="preserve"> </w:t>
-      </w:r>
-      <w:r>
-        <w:t xml:space="preserve">0,26 en validation). Le système est un outil de hiérarchisation de</w:t>
-      </w:r>
-      <w:r>
-        <w:t xml:space="preserve"> </w:t>
-      </w:r>
-      <w:r>
-        <w:t xml:space="preserve">l’attention, pas un oracle.</w:t>
+        <w:t xml:space="preserve">croisée stratifiée, contre 0 pour la référence majoritaire qui ne détecte</w:t>
+      </w:r>
+      <w:r>
+        <w:t xml:space="preserve"> </w:t>
+      </w:r>
+      <w:r>
+        <w:t xml:space="preserve">rien. Quatre classifieurs classiques ont été confrontés (régression</w:t>
+      </w:r>
+      <w:r>
+        <w:t xml:space="preserve"> </w:t>
+      </w:r>
+      <w:r>
+        <w:t xml:space="preserve">logistique, séparateur à vaste marge, arbre de décision, forêt</w:t>
+      </w:r>
+      <w:r>
+        <w:t xml:space="preserve"> </w:t>
+      </w:r>
+      <w:r>
+        <w:t xml:space="preserve">aléatoire) ; à 123 observations, leurs écarts de performance ne sont pas</w:t>
+      </w:r>
+      <w:r>
+        <w:t xml:space="preserve"> </w:t>
+      </w:r>
+      <w:r>
+        <w:t xml:space="preserve">significatifs, et le choix s’est porté sur la forêt aléatoire, dont les</w:t>
+      </w:r>
+      <w:r>
+        <w:t xml:space="preserve"> </w:t>
+      </w:r>
+      <w:r>
+        <w:t xml:space="preserve">probabilités alimentent les niveaux d’alerte de la plateforme. Le système</w:t>
+      </w:r>
+      <w:r>
+        <w:t xml:space="preserve"> </w:t>
+      </w:r>
+      <w:r>
+        <w:t xml:space="preserve">est un outil de hiérarchisation de l’attention, pas un oracle.</w:t>
       </w:r>
     </w:p>
     <w:bookmarkEnd w:id="39"/>
@@ -2133,7 +2097,7 @@
           <wp:inline>
             <wp:extent cx="5334000" cy="2003589"/>
             <wp:effectExtent b="0" l="0" r="0" t="0"/>
-            <wp:docPr descr="Figure 4 — Prévision d’intensité de vente à douze mois sous trois scénarios de taux 2026, avec intervalle à 80 % (notebook 04)." title="" id="41" name="Picture"/>
+            <wp:docPr descr="Figure 4 — Prévision d’intensité de vente à douze mois sous trois scénarios de taux 2026, avec intervalle à 80 %." title="" id="41" name="Picture"/>
             <a:graphic>
               <a:graphicData uri="http://schemas.openxmlformats.org/drawingml/2006/picture">
                 <pic:pic>
@@ -2176,7 +2140,7 @@
         <w:pStyle w:val="ImageCaption"/>
       </w:pPr>
       <w:r>
-        <w:t xml:space="preserve">Figure 4 — Prévision d’intensité de vente à douze mois sous trois scénarios de taux 2026, avec intervalle à 80 % (notebook 04).</w:t>
+        <w:t xml:space="preserve">Figure 4 — Prévision d’intensité de vente à douze mois sous trois scénarios de taux 2026, avec intervalle à 80 %.</w:t>
       </w:r>
     </w:p>
     <w:p>
@@ -2238,7 +2202,7 @@
           <wp:inline>
             <wp:extent cx="5334000" cy="3130051"/>
             <wp:effectExtent b="0" l="0" r="0" t="0"/>
-            <wp:docPr descr="Figure 5 — Réservations cumulées et courbes logistiques ajustées sur quatre opérations terminées, avec le repère des 90 % du potentiel (notebook 04)." title="" id="44" name="Picture"/>
+            <wp:docPr descr="Figure 5 — Réservations cumulées et courbes logistiques ajustées sur quatre opérations terminées, avec le repère des 90 % du potentiel." title="" id="44" name="Picture"/>
             <a:graphic>
               <a:graphicData uri="http://schemas.openxmlformats.org/drawingml/2006/picture">
                 <pic:pic>
@@ -2281,7 +2245,7 @@
         <w:pStyle w:val="ImageCaption"/>
       </w:pPr>
       <w:r>
-        <w:t xml:space="preserve">Figure 5 — Réservations cumulées et courbes logistiques ajustées sur quatre opérations terminées, avec le repère des 90 % du potentiel (notebook 04).</w:t>
+        <w:t xml:space="preserve">Figure 5 — Réservations cumulées et courbes logistiques ajustées sur quatre opérations terminées, avec le repère des 90 % du potentiel.</w:t>
       </w:r>
     </w:p>
     <w:bookmarkEnd w:id="46"/>
@@ -2389,7 +2353,7 @@
           <wp:inline>
             <wp:extent cx="5334000" cy="1970632"/>
             <wp:effectExtent b="0" l="0" r="0" t="0"/>
-            <wp:docPr descr="Figure 6 — Effet millésime du modèle de prix (prime par année de réservation, référence 2016) (notebook 05)." title="" id="48" name="Picture"/>
+            <wp:docPr descr="Figure 6 — Effet millésime du modèle de prix (prime par année de réservation, référence 2016)." title="" id="48" name="Picture"/>
             <a:graphic>
               <a:graphicData uri="http://schemas.openxmlformats.org/drawingml/2006/picture">
                 <pic:pic>
@@ -2432,7 +2396,7 @@
         <w:pStyle w:val="ImageCaption"/>
       </w:pPr>
       <w:r>
-        <w:t xml:space="preserve">Figure 6 — Effet millésime du modèle de prix (prime par année de réservation, référence 2016) (notebook 05).</w:t>
+        <w:t xml:space="preserve">Figure 6 — Effet millésime du modèle de prix (prime par année de réservation, référence 2016).</w:t>
       </w:r>
     </w:p>
     <w:p>
@@ -2464,7 +2428,7 @@
           <wp:inline>
             <wp:extent cx="5334000" cy="2094331"/>
             <wp:effectExtent b="0" l="0" r="0" t="0"/>
-            <wp:docPr descr="Figure 7 — Stock d’appartements : prix grille contre prix de marché estimé, bande à plus ou moins une erreur type (notebook 05)." title="" id="51" name="Picture"/>
+            <wp:docPr descr="Figure 7 — Stock d’appartements : prix grille contre prix de marché estimé, bande à plus ou moins une erreur type." title="" id="51" name="Picture"/>
             <a:graphic>
               <a:graphicData uri="http://schemas.openxmlformats.org/drawingml/2006/picture">
                 <pic:pic>
@@ -2507,7 +2471,7 @@
         <w:pStyle w:val="ImageCaption"/>
       </w:pPr>
       <w:r>
-        <w:t xml:space="preserve">Figure 7 — Stock d’appartements : prix grille contre prix de marché estimé, bande à plus ou moins une erreur type (notebook 05).</w:t>
+        <w:t xml:space="preserve">Figure 7 — Stock d’appartements : prix grille contre prix de marché estimé, bande à plus ou moins une erreur type.</w:t>
       </w:r>
     </w:p>
     <w:p>
@@ -3255,7 +3219,7 @@
         <w:t xml:space="preserve"> </w:t>
       </w:r>
       <w:r>
-        <w:t xml:space="preserve">traitement dédié ; les notebooks conservent les 267 opérations, et la</w:t>
+        <w:t xml:space="preserve">traitement dédié ; l’analyse, elle, couvre les 267 opérations, et la</w:t>
       </w:r>
       <w:r>
         <w:t xml:space="preserve"> </w:t>

</xml_diff>